<commit_message>
docs : mise à jour du JDB du 29 mai
</commit_message>
<xml_diff>
--- a/docs/journal-de-bord/JDB_29_05_26.docx
+++ b/docs/journal-de-bord/JDB_29_05_26.docx
@@ -79,31 +79,7 @@
           <w:szCs w:val="20"/>
           <w:lang w:val="en-US"/>
         </w:rPr>
-        <w:t xml:space="preserve"> </w:t>
-      </w:r>
-      <w:proofErr w:type="gramStart"/>
-      <w:r>
-        <w:rPr>
-          <w:i/>
-          <w:iCs/>
-          <w:color w:val="888888"/>
-          <w:sz w:val="20"/>
-          <w:szCs w:val="20"/>
-          <w:lang w:val="en-US"/>
-        </w:rPr>
-        <w:t>Alison  ·</w:t>
-      </w:r>
-      <w:proofErr w:type="gramEnd"/>
-      <w:r>
-        <w:rPr>
-          <w:i/>
-          <w:iCs/>
-          <w:color w:val="888888"/>
-          <w:sz w:val="20"/>
-          <w:szCs w:val="20"/>
-          <w:lang w:val="en-US"/>
-        </w:rPr>
-        <w:t xml:space="preserve">  Holberton School — Thonon-les-Bains</w:t>
+        <w:t xml:space="preserve"> Alison  ·  Holberton School — Thonon-les-Bains</w:t>
       </w:r>
     </w:p>
     <w:p>
@@ -128,7 +104,23 @@
           <w:sz w:val="24"/>
           <w:szCs w:val="24"/>
         </w:rPr>
-        <w:t xml:space="preserve">  29 mai 2026  </w:t>
+        <w:t xml:space="preserve">  29 mai 2026 </w:t>
+      </w:r>
+      <w:r>
+        <w:rPr>
+          <w:color w:val="D6E8D0"/>
+          <w:sz w:val="24"/>
+          <w:szCs w:val="24"/>
+        </w:rPr>
+        <w:t>matin</w:t>
+      </w:r>
+      <w:r>
+        <w:rPr>
+          <w:color w:val="D6E8D0"/>
+          <w:sz w:val="24"/>
+          <w:szCs w:val="24"/>
+        </w:rPr>
+        <w:t xml:space="preserve"> </w:t>
       </w:r>
       <w:r>
         <w:rPr>
@@ -159,7 +151,17 @@
           <w:sz w:val="26"/>
           <w:szCs w:val="26"/>
         </w:rPr>
-        <w:t>Statut général — fin de journée</w:t>
+        <w:t xml:space="preserve">Statut général — fin de </w:t>
+      </w:r>
+      <w:r>
+        <w:rPr>
+          <w:b/>
+          <w:bCs/>
+          <w:color w:val="4A7C59"/>
+          <w:sz w:val="26"/>
+          <w:szCs w:val="26"/>
+        </w:rPr>
+        <w:t>matinée</w:t>
       </w:r>
     </w:p>
     <w:p>
@@ -189,12 +191,6 @@
         <w:gridCol w:w="7002"/>
       </w:tblGrid>
       <w:tr>
-        <w:tblPrEx>
-          <w:tblCellMar>
-            <w:top w:w="0" w:type="dxa"/>
-            <w:bottom w:w="0" w:type="dxa"/>
-          </w:tblCellMar>
-        </w:tblPrEx>
         <w:tc>
           <w:tcPr>
             <w:tcW w:w="3770" w:type="dxa"/>
@@ -273,12 +269,6 @@
         </w:tc>
       </w:tr>
       <w:tr>
-        <w:tblPrEx>
-          <w:tblCellMar>
-            <w:top w:w="0" w:type="dxa"/>
-            <w:bottom w:w="0" w:type="dxa"/>
-          </w:tblCellMar>
-        </w:tblPrEx>
         <w:tc>
           <w:tcPr>
             <w:tcW w:w="3770" w:type="dxa"/>
@@ -339,12 +329,6 @@
         </w:tc>
       </w:tr>
       <w:tr>
-        <w:tblPrEx>
-          <w:tblCellMar>
-            <w:top w:w="0" w:type="dxa"/>
-            <w:bottom w:w="0" w:type="dxa"/>
-          </w:tblCellMar>
-        </w:tblPrEx>
         <w:tc>
           <w:tcPr>
             <w:tcW w:w="3770" w:type="dxa"/>
@@ -405,12 +389,6 @@
         </w:tc>
       </w:tr>
       <w:tr>
-        <w:tblPrEx>
-          <w:tblCellMar>
-            <w:top w:w="0" w:type="dxa"/>
-            <w:bottom w:w="0" w:type="dxa"/>
-          </w:tblCellMar>
-        </w:tblPrEx>
         <w:tc>
           <w:tcPr>
             <w:tcW w:w="3770" w:type="dxa"/>
@@ -497,12 +475,6 @@
         </w:tc>
       </w:tr>
       <w:tr>
-        <w:tblPrEx>
-          <w:tblCellMar>
-            <w:top w:w="0" w:type="dxa"/>
-            <w:bottom w:w="0" w:type="dxa"/>
-          </w:tblCellMar>
-        </w:tblPrEx>
         <w:tc>
           <w:tcPr>
             <w:tcW w:w="3770" w:type="dxa"/>
@@ -557,36 +529,12 @@
                 <w:sz w:val="19"/>
                 <w:szCs w:val="19"/>
               </w:rPr>
-              <w:t xml:space="preserve">✅ Tables vérifiées — 6 tables visibles sur </w:t>
-            </w:r>
-            <w:proofErr w:type="gramStart"/>
-            <w:r>
-              <w:rPr>
-                <w:color w:val="2D4A2D"/>
-                <w:sz w:val="19"/>
-                <w:szCs w:val="19"/>
-              </w:rPr>
-              <w:t>localhost:</w:t>
-            </w:r>
-            <w:proofErr w:type="gramEnd"/>
-            <w:r>
-              <w:rPr>
-                <w:color w:val="2D4A2D"/>
-                <w:sz w:val="19"/>
-                <w:szCs w:val="19"/>
-              </w:rPr>
-              <w:t>5555</w:t>
+              <w:t>✅ Tables vérifiées — 6 tables visibles sur localhost:5555</w:t>
             </w:r>
           </w:p>
         </w:tc>
       </w:tr>
       <w:tr>
-        <w:tblPrEx>
-          <w:tblCellMar>
-            <w:top w:w="0" w:type="dxa"/>
-            <w:bottom w:w="0" w:type="dxa"/>
-          </w:tblCellMar>
-        </w:tblPrEx>
         <w:tc>
           <w:tcPr>
             <w:tcW w:w="3770" w:type="dxa"/>
@@ -647,12 +595,6 @@
         </w:tc>
       </w:tr>
       <w:tr>
-        <w:tblPrEx>
-          <w:tblCellMar>
-            <w:top w:w="0" w:type="dxa"/>
-            <w:bottom w:w="0" w:type="dxa"/>
-          </w:tblCellMar>
-        </w:tblPrEx>
         <w:tc>
           <w:tcPr>
             <w:tcW w:w="3770" w:type="dxa"/>
@@ -891,7 +833,6 @@
         </w:numPr>
       </w:pPr>
       <w:proofErr w:type="spellStart"/>
-      <w:proofErr w:type="gramStart"/>
       <w:r>
         <w:rPr>
           <w:color w:val="333333"/>
@@ -901,7 +842,6 @@
         <w:t>npx</w:t>
       </w:r>
       <w:proofErr w:type="spellEnd"/>
-      <w:proofErr w:type="gramEnd"/>
       <w:r>
         <w:rPr>
           <w:color w:val="333333"/>
@@ -1003,25 +943,7 @@
           <w:sz w:val="19"/>
           <w:szCs w:val="19"/>
         </w:rPr>
-        <w:t xml:space="preserve"> backend créé — </w:t>
-      </w:r>
-      <w:proofErr w:type="gramStart"/>
-      <w:r>
-        <w:rPr>
-          <w:color w:val="333333"/>
-          <w:sz w:val="19"/>
-          <w:szCs w:val="19"/>
-        </w:rPr>
-        <w:t>node:</w:t>
-      </w:r>
-      <w:proofErr w:type="gramEnd"/>
-      <w:r>
-        <w:rPr>
-          <w:color w:val="333333"/>
-          <w:sz w:val="19"/>
-          <w:szCs w:val="19"/>
-        </w:rPr>
-        <w:t xml:space="preserve">20-alpine, port 3000, </w:t>
+        <w:t xml:space="preserve"> backend créé — node:20-alpine, port 3000, </w:t>
       </w:r>
       <w:proofErr w:type="spellStart"/>
       <w:r>
@@ -1058,25 +980,7 @@
           <w:sz w:val="19"/>
           <w:szCs w:val="19"/>
         </w:rPr>
-        <w:t xml:space="preserve"> frontend créé — </w:t>
-      </w:r>
-      <w:proofErr w:type="gramStart"/>
-      <w:r>
-        <w:rPr>
-          <w:color w:val="333333"/>
-          <w:sz w:val="19"/>
-          <w:szCs w:val="19"/>
-        </w:rPr>
-        <w:t>node:</w:t>
-      </w:r>
-      <w:proofErr w:type="gramEnd"/>
-      <w:r>
-        <w:rPr>
-          <w:color w:val="333333"/>
-          <w:sz w:val="19"/>
-          <w:szCs w:val="19"/>
-        </w:rPr>
-        <w:t>20-alpine, port 5173, vite --host</w:t>
+        <w:t xml:space="preserve"> frontend créé — node:20-alpine, port 5173, vite --host</w:t>
       </w:r>
     </w:p>
     <w:p>
@@ -1295,23 +1199,13 @@
           <w:numId w:val="2"/>
         </w:numPr>
       </w:pPr>
-      <w:proofErr w:type="gramStart"/>
-      <w:r>
-        <w:rPr>
-          <w:color w:val="333333"/>
-          <w:sz w:val="19"/>
-          <w:szCs w:val="19"/>
-        </w:rPr>
-        <w:t>docker</w:t>
-      </w:r>
-      <w:proofErr w:type="gramEnd"/>
-      <w:r>
-        <w:rPr>
-          <w:color w:val="333333"/>
-          <w:sz w:val="19"/>
-          <w:szCs w:val="19"/>
-        </w:rPr>
-        <w:t xml:space="preserve"> compose up --</w:t>
+      <w:r>
+        <w:rPr>
+          <w:color w:val="333333"/>
+          <w:sz w:val="19"/>
+          <w:szCs w:val="19"/>
+        </w:rPr>
+        <w:t>docker compose up --</w:t>
       </w:r>
       <w:proofErr w:type="spellStart"/>
       <w:r>
@@ -1466,12 +1360,6 @@
         <w:gridCol w:w="3448"/>
       </w:tblGrid>
       <w:tr>
-        <w:tblPrEx>
-          <w:tblCellMar>
-            <w:top w:w="0" w:type="dxa"/>
-            <w:bottom w:w="0" w:type="dxa"/>
-          </w:tblCellMar>
-        </w:tblPrEx>
         <w:tc>
           <w:tcPr>
             <w:tcW w:w="3231" w:type="dxa"/>
@@ -1564,12 +1452,6 @@
         </w:tc>
       </w:tr>
       <w:tr>
-        <w:tblPrEx>
-          <w:tblCellMar>
-            <w:top w:w="0" w:type="dxa"/>
-            <w:bottom w:w="0" w:type="dxa"/>
-          </w:tblCellMar>
-        </w:tblPrEx>
         <w:tc>
           <w:tcPr>
             <w:tcW w:w="3231" w:type="dxa"/>
@@ -1686,12 +1568,6 @@
         </w:tc>
       </w:tr>
       <w:tr>
-        <w:tblPrEx>
-          <w:tblCellMar>
-            <w:top w:w="0" w:type="dxa"/>
-            <w:bottom w:w="0" w:type="dxa"/>
-          </w:tblCellMar>
-        </w:tblPrEx>
         <w:tc>
           <w:tcPr>
             <w:tcW w:w="3231" w:type="dxa"/>
@@ -1808,12 +1684,6 @@
         </w:tc>
       </w:tr>
       <w:tr>
-        <w:tblPrEx>
-          <w:tblCellMar>
-            <w:top w:w="0" w:type="dxa"/>
-            <w:bottom w:w="0" w:type="dxa"/>
-          </w:tblCellMar>
-        </w:tblPrEx>
         <w:tc>
           <w:tcPr>
             <w:tcW w:w="3231" w:type="dxa"/>
@@ -1940,12 +1810,6 @@
         </w:tc>
       </w:tr>
       <w:tr>
-        <w:tblPrEx>
-          <w:tblCellMar>
-            <w:top w:w="0" w:type="dxa"/>
-            <w:bottom w:w="0" w:type="dxa"/>
-          </w:tblCellMar>
-        </w:tblPrEx>
         <w:tc>
           <w:tcPr>
             <w:tcW w:w="3231" w:type="dxa"/>
@@ -2034,12 +1898,6 @@
         </w:tc>
       </w:tr>
       <w:tr>
-        <w:tblPrEx>
-          <w:tblCellMar>
-            <w:top w:w="0" w:type="dxa"/>
-            <w:bottom w:w="0" w:type="dxa"/>
-          </w:tblCellMar>
-        </w:tblPrEx>
         <w:tc>
           <w:tcPr>
             <w:tcW w:w="3231" w:type="dxa"/>
@@ -2134,12 +1992,6 @@
         </w:tc>
       </w:tr>
       <w:tr>
-        <w:tblPrEx>
-          <w:tblCellMar>
-            <w:top w:w="0" w:type="dxa"/>
-            <w:bottom w:w="0" w:type="dxa"/>
-          </w:tblCellMar>
-        </w:tblPrEx>
         <w:tc>
           <w:tcPr>
             <w:tcW w:w="3231" w:type="dxa"/>
@@ -2158,23 +2010,13 @@
             </w:tcMar>
           </w:tcPr>
           <w:p>
-            <w:proofErr w:type="gramStart"/>
             <w:r>
               <w:rPr>
                 <w:color w:val="333333"/>
                 <w:sz w:val="18"/>
                 <w:szCs w:val="18"/>
               </w:rPr>
-              <w:t>localhost:</w:t>
-            </w:r>
-            <w:proofErr w:type="gramEnd"/>
-            <w:r>
-              <w:rPr>
-                <w:color w:val="333333"/>
-                <w:sz w:val="18"/>
-                <w:szCs w:val="18"/>
-              </w:rPr>
-              <w:t>5173</w:t>
+              <w:t>localhost:5173</w:t>
             </w:r>
           </w:p>
         </w:tc>
@@ -2238,12 +2080,6 @@
         </w:tc>
       </w:tr>
       <w:tr>
-        <w:tblPrEx>
-          <w:tblCellMar>
-            <w:top w:w="0" w:type="dxa"/>
-            <w:bottom w:w="0" w:type="dxa"/>
-          </w:tblCellMar>
-        </w:tblPrEx>
         <w:tc>
           <w:tcPr>
             <w:tcW w:w="3231" w:type="dxa"/>
@@ -2262,23 +2098,13 @@
             </w:tcMar>
           </w:tcPr>
           <w:p>
-            <w:proofErr w:type="gramStart"/>
             <w:r>
               <w:rPr>
                 <w:color w:val="333333"/>
                 <w:sz w:val="18"/>
                 <w:szCs w:val="18"/>
               </w:rPr>
-              <w:t>localhost:</w:t>
-            </w:r>
-            <w:proofErr w:type="gramEnd"/>
-            <w:r>
-              <w:rPr>
-                <w:color w:val="333333"/>
-                <w:sz w:val="18"/>
-                <w:szCs w:val="18"/>
-              </w:rPr>
-              <w:t>3000/api/</w:t>
+              <w:t>localhost:3000/api/</w:t>
             </w:r>
             <w:proofErr w:type="spellStart"/>
             <w:r>
@@ -2319,7 +2145,6 @@
               <w:t>{</w:t>
             </w:r>
             <w:proofErr w:type="spellStart"/>
-            <w:proofErr w:type="gramStart"/>
             <w:r>
               <w:rPr>
                 <w:color w:val="444444"/>
@@ -2335,34 +2160,7 @@
                 <w:sz w:val="18"/>
                 <w:szCs w:val="18"/>
               </w:rPr>
-              <w:t>:</w:t>
-            </w:r>
-            <w:proofErr w:type="gramEnd"/>
-            <w:r>
-              <w:rPr>
-                <w:color w:val="444444"/>
-                <w:sz w:val="18"/>
-                <w:szCs w:val="18"/>
-              </w:rPr>
-              <w:t xml:space="preserve"> ok, </w:t>
-            </w:r>
-            <w:proofErr w:type="gramStart"/>
-            <w:r>
-              <w:rPr>
-                <w:color w:val="444444"/>
-                <w:sz w:val="18"/>
-                <w:szCs w:val="18"/>
-              </w:rPr>
-              <w:t>message:</w:t>
-            </w:r>
-            <w:proofErr w:type="gramEnd"/>
-            <w:r>
-              <w:rPr>
-                <w:color w:val="444444"/>
-                <w:sz w:val="18"/>
-                <w:szCs w:val="18"/>
-              </w:rPr>
-              <w:t xml:space="preserve"> Serveur Sens Solidaire opérationnel}</w:t>
+              <w:t>: ok, message: Serveur Sens Solidaire opérationnel}</w:t>
             </w:r>
           </w:p>
         </w:tc>
@@ -2475,7 +2273,7 @@
           <w:noProof/>
         </w:rPr>
         <w:drawing>
-          <wp:inline distT="0" distB="0" distL="0" distR="0" wp14:anchorId="73736912" wp14:editId="622E8EC6">
+          <wp:inline distT="0" distB="0" distL="0" distR="0" wp14:anchorId="73736912" wp14:editId="595CEE39">
             <wp:extent cx="3070860" cy="995512"/>
             <wp:effectExtent l="0" t="0" r="0" b="0"/>
             <wp:docPr id="634004296" name="Image 2"/>
@@ -2539,7 +2337,7 @@
           <w:sz w:val="26"/>
           <w:szCs w:val="26"/>
         </w:rPr>
-        <w:t>Prévu — S2 (2 juin)</w:t>
+        <w:t xml:space="preserve">Prévu </w:t>
       </w:r>
     </w:p>
     <w:p>
@@ -2738,27 +2536,7 @@
           <w:szCs w:val="19"/>
           <w:lang w:val="en-US"/>
         </w:rPr>
-        <w:t xml:space="preserve">Auth </w:t>
-      </w:r>
-      <w:proofErr w:type="gramStart"/>
-      <w:r>
-        <w:rPr>
-          <w:color w:val="333333"/>
-          <w:sz w:val="19"/>
-          <w:szCs w:val="19"/>
-          <w:lang w:val="en-US"/>
-        </w:rPr>
-        <w:t>JWT :</w:t>
-      </w:r>
-      <w:proofErr w:type="gramEnd"/>
-      <w:r>
-        <w:rPr>
-          <w:color w:val="333333"/>
-          <w:sz w:val="19"/>
-          <w:szCs w:val="19"/>
-          <w:lang w:val="en-US"/>
-        </w:rPr>
-        <w:t xml:space="preserve"> login / logout / refresh token</w:t>
+        <w:t>Auth JWT : login / logout / refresh token</w:t>
       </w:r>
     </w:p>
     <w:p>
@@ -2928,23 +2706,13 @@
           <w:docGrid w:linePitch="360"/>
         </w:sectPr>
       </w:pPr>
-      <w:proofErr w:type="gramStart"/>
-      <w:r>
-        <w:rPr>
-          <w:color w:val="333333"/>
-          <w:sz w:val="19"/>
-          <w:szCs w:val="19"/>
-        </w:rPr>
-        <w:t>docker</w:t>
-      </w:r>
-      <w:proofErr w:type="gramEnd"/>
-      <w:r>
-        <w:rPr>
-          <w:color w:val="333333"/>
-          <w:sz w:val="19"/>
-          <w:szCs w:val="19"/>
-        </w:rPr>
-        <w:t xml:space="preserve"> compose up fonctionnel avec données réelle</w:t>
+      <w:r>
+        <w:rPr>
+          <w:color w:val="333333"/>
+          <w:sz w:val="19"/>
+          <w:szCs w:val="19"/>
+        </w:rPr>
+        <w:t>docker compose up fonctionnel avec données réelle</w:t>
       </w:r>
       <w:r>
         <w:rPr>
@@ -2992,17 +2760,7 @@
           <w:sz w:val="26"/>
           <w:szCs w:val="26"/>
         </w:rPr>
-        <w:t>N</w:t>
-      </w:r>
-      <w:r>
-        <w:rPr>
-          <w:b/>
-          <w:bCs/>
-          <w:color w:val="1A237E"/>
-          <w:sz w:val="26"/>
-          <w:szCs w:val="26"/>
-        </w:rPr>
-        <w:t>otes &amp; observations</w:t>
+        <w:t>Notes &amp; observations</w:t>
       </w:r>
     </w:p>
     <w:p>

</xml_diff>